<commit_message>
v1.1: California district lead's review folded in (no auto-renewal, screener decline, sensitive elements never requested by default, AI disclosure and demo, CITE routing), dated Oct 27
Co-Authored-By: Claude Fable 5.1 <noreply@anthropic.com>
</commit_message>
<xml_diff>
--- a/downloads/chss-case-making.docx
+++ b/downloads/chss-case-making.docx
@@ -15,7 +15,7 @@
         <w:rPr>
           <w:i/>
         </w:rPr>
-        <w:t>Draft v1.0 · Oct 26, 2026 · Center for High School Success · for discussion; not legal advice</w:t>
+        <w:t>Draft v1.1 · Oct 27, 2026 · Center for High School Success · for discussion; not legal advice</w:t>
       </w:r>
     </w:p>
     <w:p>
@@ -333,6 +333,20 @@
       </w:r>
       <w:r>
         <w:t xml:space="preserve"> When the partnership ends, or whenever you ask, identifiable data is destroyed and we certify it.</w:t>
+      </w:r>
+    </w:p>
+    <w:p>
+      <w:pPr>
+        <w:pStyle w:val="ListBullet"/>
+      </w:pPr>
+      <w:r>
+        <w:rPr>
+          <w:b/>
+        </w:rPr>
+        <w:t>No automatic renewal.</w:t>
+      </w:r>
+      <w:r>
+        <w:t xml:space="preserve"> The data partnership ends with the agreement. Continuing it takes a new signature, not silence.</w:t>
       </w:r>
     </w:p>
     <w:p>

</xml_diff>

<commit_message>
v1.3: single coach-access model bound to school and purpose, formal case-making, Emily's gap analysis, NDPA packet and email, changelog page
Co-Authored-By: Claude Fable 5.1 <noreply@anthropic.com>
</commit_message>
<xml_diff>
--- a/downloads/chss-case-making.docx
+++ b/downloads/chss-case-making.docx
@@ -15,12 +15,12 @@
         <w:rPr>
           <w:i/>
         </w:rPr>
-        <w:t>Draft v1.2 · Oct 27, 2026 · Center for High School Success · for discussion; not legal advice</w:t>
+        <w:t>Draft v1.3 · Oct 27, 2026 · Center for High School Success · for discussion; not legal advice</w:t>
       </w:r>
     </w:p>
     <w:p>
       <w:r>
-        <w:t>Syncing your Student Information System (SIS) with CHSS Navigator gives your ninth grade team timely, accurate data through clear visualizations and a dashboard that updates automatically. Your team can analyze, discuss, and intervene in minutes, without running reports, downloading files, and entering formulas. Most districts don't have a ninth grade dashboard like this, or the time and budget to build one. CHSS builds and maintains it for you.</w:t>
+        <w:t>Connecting the CHSS Navigator to a district's Student Information System (SIS) gives the ninth grade team timely, accurate data through clear visualizations and a dashboard that updates automatically. The team can analyze, discuss, and intervene in minutes, without running reports, downloading files, or entering formulas. Few districts have a ninth grade dashboard of this kind, or the time and budget to build one. CHSS builds and maintains it for each partner school.</w:t>
       </w:r>
     </w:p>
     <w:p>
@@ -33,7 +33,7 @@
     </w:p>
     <w:p>
       <w:r>
-        <w:t>Without an integration, almost every coaching session starts the same way:</w:t>
+        <w:t>Without an integration, nearly every coaching session begins the same way:</w:t>
       </w:r>
     </w:p>
     <w:p>
@@ -49,7 +49,7 @@
         <w:pStyle w:val="ListNumber"/>
       </w:pPr>
       <w:r>
-        <w:t>The report is exported to Excel.</w:t>
+        <w:t>The report is exported to a spreadsheet.</w:t>
       </w:r>
     </w:p>
     <w:p>
@@ -57,22 +57,22 @@
         <w:pStyle w:val="ListNumber"/>
       </w:pPr>
       <w:r>
-        <w:t>The lead and coach add formulas to flag which students are failing one or two courses.</w:t>
+        <w:t>The lead and the coach add formulas to identify which students are failing one or two courses.</w:t>
       </w:r>
     </w:p>
     <w:p>
       <w:r>
-        <w:t>That routine eats 20 to 30 minutes of a 60-minute session. Half the hour goes to clerical work instead of kids, and the data is often a full grading period old by the time anyone acts on it.</w:t>
+        <w:t>That routine consumes 20 to 30 minutes of a 60-minute session. Half of the hour goes to clerical work rather than to students, and the data is often a full grading period old by the time anyone acts on it.</w:t>
       </w:r>
     </w:p>
     <w:p>
       <w:r>
-        <w:t>District staff carry a burden too. Each quarter, CHSS asks a district data specialist to pull a large download and upload it to a secure location. That takes time from your most technical people, and the data is months old by the time it's used. Once your automated feed is running, none of that is manual: no emails, no one running reports for CHSS, no one handling files by hand.</w:t>
+        <w:t>District staff carry a burden as well. Each quarter, CHSS asks a district data specialist to prepare a large export and upload it to a secure location. That takes time from the district's most technical people, and the data is months old by the time it is used. Once the automated feed is running, none of that work is manual: no emails, no one running reports for CHSS, and no one handling files by hand.</w:t>
       </w:r>
     </w:p>
     <w:p>
       <w:r>
-        <w:t>This matters because the protocol depends on it. In CHSS partner data, running the Kid Talk protocol with fidelity is associated with a more than 70 percent higher likelihood of hitting the school's on-track goal, and a Kid Talk only works with current data in front of the team. [Method and comparison group to be footnoted once validated.]</w:t>
+        <w:t>This matters because the protocol depends on it. In CHSS partner data, running the Kid Talk protocol with fidelity is associated with a more than 70 percent higher likelihood of meeting the school's on-track goal, and a Kid Talk is only as good as the data in front of the team. [Method and comparison group to be footnoted once validated.]</w:t>
       </w:r>
     </w:p>
     <w:p>
@@ -80,12 +80,12 @@
         <w:pStyle w:val="Heading2"/>
       </w:pPr>
       <w:r>
-        <w:t>What SIS integration gives your team</w:t>
+        <w:t>What SIS integration gives the school team</w:t>
       </w:r>
     </w:p>
     <w:p>
       <w:r>
-        <w:t>Student data flows securely from your SIS into CHSS Navigator, where CHSS builds the ninth grade dashboards your team uses. Teams stop building the data and start using it.</w:t>
+        <w:t>Student data flows securely from the district's SIS into CHSS Navigator, where CHSS builds the ninth grade dashboards the team uses. Teams stop assembling data and start using it.</w:t>
       </w:r>
     </w:p>
     <w:p>
@@ -96,10 +96,10 @@
         <w:rPr>
           <w:b/>
         </w:rPr>
-        <w:t>Time back for kids.</w:t>
+        <w:t>Time returned to students.</w:t>
       </w:r>
       <w:r>
-        <w:t xml:space="preserve"> The 20 to 30 minutes once spent preparing data goes back to talking about students.</w:t>
+        <w:t xml:space="preserve"> The 20 to 30 minutes once spent preparing data goes back to the conversation about students.</w:t>
       </w:r>
     </w:p>
     <w:p>
@@ -113,7 +113,7 @@
         <w:t>Current data.</w:t>
       </w:r>
       <w:r>
-        <w:t xml:space="preserve"> Weekly updates once your feed is live: Friday's data for Tuesday's conversation, not last quarter's.</w:t>
+        <w:t xml:space="preserve"> Weekly updates once the feed is live: Friday's data for Tuesday's meeting, rather than last quarter's.</w:t>
       </w:r>
     </w:p>
     <w:p>
@@ -127,7 +127,7 @@
         <w:t>Accurate data.</w:t>
       </w:r>
       <w:r>
-        <w:t xml:space="preserve"> No manual exports or formulas means no copy errors or broken spreadsheets.</w:t>
+        <w:t xml:space="preserve"> No manual exports or formulas means no transcription errors and no broken spreadsheets.</w:t>
       </w:r>
     </w:p>
     <w:p>
@@ -141,7 +141,7 @@
         <w:t>Faster action.</w:t>
       </w:r>
       <w:r>
-        <w:t xml:space="preserve"> Teams spot students failing one or two courses and plan support in the same meeting.</w:t>
+        <w:t xml:space="preserve"> Teams identify students failing one or two courses and plan support in the same meeting.</w:t>
       </w:r>
     </w:p>
     <w:p>
@@ -166,10 +166,10 @@
         <w:rPr>
           <w:b/>
         </w:rPr>
-        <w:t>A view past ninth grade.</w:t>
+        <w:t>A view beyond ninth grade.</w:t>
       </w:r>
       <w:r>
-        <w:t xml:space="preserve"> As your cohort moves on, Navigator keeps following it: on-track persistence in 10th grade, CTE course sequences, dual credit, graduation. You see whether the ninth grade work held, and so does your board.</w:t>
+        <w:t xml:space="preserve"> As the cohort advances, Navigator continues to follow it: on-track persistence in tenth grade, CTE course sequences, dual credit, and graduation. The district sees whether the ninth grade work held, and so does its board.</w:t>
       </w:r>
     </w:p>
     <w:p>
@@ -180,10 +180,10 @@
         <w:rPr>
           <w:b/>
         </w:rPr>
-        <w:t>End-of-year answers in June, not October.</w:t>
+        <w:t>End-of-year results in June rather than October.</w:t>
       </w:r>
       <w:r>
-        <w:t xml:space="preserve"> Automated feeds mean your on-track results are ready when you plan the next year, not after it has started.</w:t>
+        <w:t xml:space="preserve"> Automated feeds mean on-track results are available when the next year is being planned, not after it has begun.</w:t>
       </w:r>
     </w:p>
     <w:p>
@@ -191,12 +191,12 @@
         <w:pStyle w:val="Heading2"/>
       </w:pPr>
       <w:r>
-        <w:t>What it gives your district</w:t>
+        <w:t>What it gives the district</w:t>
       </w:r>
     </w:p>
     <w:p>
       <w:r>
-        <w:t>Most districts run reports by hand because nobody has had the time to set up the alternative. The integration work we do together changes that:</w:t>
+        <w:t>Most districts run reports by hand because no one has had time to establish the alternative. The integration work done together changes that:</w:t>
       </w:r>
     </w:p>
     <w:p>
@@ -210,7 +210,7 @@
         <w:t>$0 due to CHSS.</w:t>
       </w:r>
       <w:r>
-        <w:t xml:space="preserve"> The accelerator, the dashboard, and the integration work are fully subsidized for Year 0 and Year 1. The amount due from your district under the agreement is $0. What it asks of your staff is stated honestly below.</w:t>
+        <w:t xml:space="preserve"> The accelerator, the dashboard, and the integration work are fully subsidized for Year 0 and Year 1. The amount due from the district under the agreement is $0. What the work asks of district staff is stated plainly below.</w:t>
       </w:r>
     </w:p>
     <w:p>
@@ -221,10 +221,10 @@
         <w:rPr>
           <w:b/>
         </w:rPr>
-        <w:t>We set it up with you, and stay until it works.</w:t>
+        <w:t>CHSS sets it up with the district and stays until it works.</w:t>
       </w:r>
       <w:r>
-        <w:t xml:space="preserve"> CHSS technical staff meet with your data team, map your SIS exports to the Navigator format, and set up the feed. We stay with it until the feed passes acceptance, and we come back when your SIS, grading scale, or term structure changes. Most districts need two to four working sessions over a few weeks; your data person runs the export, we handle the mapping and the monitoring.</w:t>
+        <w:t xml:space="preserve"> CHSS technical staff meet with the district's data team, map the SIS exports to the Navigator format, and establish the feed. CHSS remains engaged until the feed passes acceptance, and returns when the district's SIS, grading scale, or term structure changes. Most districts need two to four working sessions over a few weeks; the district's data contact runs the export, and CHSS handles the mapping and the monitoring.</w:t>
       </w:r>
     </w:p>
     <w:p>
@@ -235,10 +235,10 @@
         <w:rPr>
           <w:b/>
         </w:rPr>
-        <w:t>A path to owning your data.</w:t>
+        <w:t>A path to owning district data.</w:t>
       </w:r>
       <w:r>
-        <w:t xml:space="preserve"> If your district doesn't already keep a nightly copy of its SIS data in a place you control, the feed we build together is a first step, and we'll point you at the routes other districts have taken. Once you have it, every future partner, dashboard, and analysis gets easier, not just ours.</w:t>
+        <w:t xml:space="preserve"> For a district that does not yet keep a nightly copy of its SIS data in a location it controls, the feed built together is a first step, and CHSS will share the routes other districts have taken. Once a district has that foundation, every future partner, dashboard, and analysis becomes easier.</w:t>
       </w:r>
     </w:p>
     <w:p>
@@ -252,7 +252,7 @@
         <w:t>Nothing to remember.</w:t>
       </w:r>
       <w:r>
-        <w:t xml:space="preserve"> Once the feed runs, no one on your staff runs a report for CHSS again. If a transfer fails, our system notices and we follow up.</w:t>
+        <w:t xml:space="preserve"> Once the feed runs, no district employee runs a report for CHSS again. If a transfer fails, CHSS's monitoring detects it and CHSS follows up.</w:t>
       </w:r>
     </w:p>
     <w:p>
@@ -266,7 +266,7 @@
         <w:t>Clean records.</w:t>
       </w:r>
       <w:r>
-        <w:t xml:space="preserve"> You get an executed copy of every agreement, indexed, and a reminder before anything expires.</w:t>
+        <w:t xml:space="preserve"> The district receives an executed copy of every agreement, indexed, and a reminder before anything expires.</w:t>
       </w:r>
     </w:p>
     <w:p>
@@ -274,10 +274,10 @@
         <w:rPr>
           <w:b/>
         </w:rPr>
-        <w:t>What we ask of your staff, honestly.</w:t>
+        <w:t>What CHSS asks of district staff.</w:t>
       </w:r>
       <w:r>
-        <w:t xml:space="preserve"> A technical contact and a privacy contact named in the first two weeks. One onboarding call with both. The hours above to stand up the feed, more if your district needs the scheduled-upload route for a while. Nothing from your teachers beyond the ninth grade team work the accelerator already asks for. Data for your ninth grade cohort starts flowing in August 2027; the months before that are for getting the feed and the agreement in place.</w:t>
+        <w:t xml:space="preserve"> A technical contact and a privacy contact, named at acceptance. One onboarding call with both. The hours above to establish the feed, and more if the district needs the scheduled-upload route for a period. Nothing from teachers beyond the ninth grade team work the accelerator already requires. Data for the ninth grade cohort begins flowing in August 2027; the months before that are for putting the feed and the agreement in place.</w:t>
       </w:r>
     </w:p>
     <w:p>
@@ -290,7 +290,7 @@
     </w:p>
     <w:p>
       <w:r>
-        <w:t>SIS integration is governed by a data sharing agreement with your district and designed to meet FERPA and your state's student privacy requirements. CHSS provides its own privacy and security appendix and will also sign the National Data Privacy Agreement (NDPA) in your state's version if your district prefers it. Your student data remains your district's property, and your district decides who can see it.</w:t>
+        <w:t>SIS integration is governed by a data sharing agreement with the district and designed to meet FERPA and the state's student privacy requirements. CHSS provides its own privacy and security appendix and will also sign the National Data Privacy Agreement (NDPA) in the state's version if the district prefers it. Student data remains the district's property, and the district decides who may see it.</w:t>
       </w:r>
     </w:p>
     <w:p>
@@ -304,7 +304,7 @@
         <w:t>Only the data needed.</w:t>
       </w:r>
       <w:r>
-        <w:t xml:space="preserve"> CHSS receives student ID, name, grade level and enrollment dates, course enrollments, course marks and credits by grading period, GPA, and attendance. Nothing else is required. Responses to the short belonging and skills screeners your team administers, after you approve the questions, are held under the same terms.</w:t>
+        <w:t xml:space="preserve"> CHSS receives student ID, name, grade level and enrollment dates, course enrollments, course marks and credits by grading period, GPA, and attendance. Nothing else is required. Responses to the short belonging and skills screeners the school team administers, after the district approves the questions, are held under the same terms.</w:t>
       </w:r>
     </w:p>
     <w:p>
@@ -318,7 +318,7 @@
         <w:t>Used for one purpose.</w:t>
       </w:r>
       <w:r>
-        <w:t xml:space="preserve"> Identifiable student information supports ninth grade success work in your schools and nothing else. CHSS keeps only de-identified and aggregate results to evaluate and improve the program.</w:t>
+        <w:t xml:space="preserve"> Identifiable student information supports ninth grade success work in the district's schools and nothing else. CHSS retains only de-identified and aggregate results to evaluate and improve the program.</w:t>
       </w:r>
     </w:p>
     <w:p>
@@ -329,10 +329,10 @@
         <w:rPr>
           <w:b/>
         </w:rPr>
-        <w:t>Deleted when you say so.</w:t>
+        <w:t>Deleted when the district says so.</w:t>
       </w:r>
       <w:r>
-        <w:t xml:space="preserve"> When the partnership ends, or whenever you ask, identifiable data is destroyed and we certify it.</w:t>
+        <w:t xml:space="preserve"> When the partnership ends, or whenever the district asks, identifiable data is destroyed and the destruction is certified.</w:t>
       </w:r>
     </w:p>
     <w:p>
@@ -346,7 +346,7 @@
         <w:t>No automatic renewal.</w:t>
       </w:r>
       <w:r>
-        <w:t xml:space="preserve"> The data partnership ends with the agreement. Continuing it takes a new signature, not silence.</w:t>
+        <w:t xml:space="preserve"> The data partnership ends with the agreement. Continuing it requires a new signature, not silence.</w:t>
       </w:r>
     </w:p>
     <w:p>
@@ -359,7 +359,7 @@
     </w:p>
     <w:p>
       <w:r>
-        <w:t>Student names live in Navigator for one reason: so the educators responsible for a student know who needs support and can act. Role-based permissions decide who can see them.</w:t>
+        <w:t>Student names are visible in Navigator for one reason: so that the educators responsible for a student know who needs support and can act. Role-based permissions determine who may see them.</w:t>
       </w:r>
     </w:p>
     <w:tbl>
@@ -437,7 +437,7 @@
           <w:p>
             <w:r/>
             <w:r>
-              <w:t>Your school team (individual logins)</w:t>
+              <w:t>The school team (individual logins)</w:t>
             </w:r>
           </w:p>
         </w:tc>
@@ -459,7 +459,7 @@
           <w:p>
             <w:r/>
             <w:r>
-              <w:t>To identify students, build intervention plans, and monitor progress kid by kid</w:t>
+              <w:t>To identify students, build intervention plans, and monitor progress student by student</w:t>
             </w:r>
           </w:p>
         </w:tc>
@@ -472,7 +472,7 @@
           <w:p>
             <w:r/>
             <w:r>
-              <w:t>CHSS coaches</w:t>
+              <w:t>CHSS coaching staff assigned to the school</w:t>
             </w:r>
           </w:p>
         </w:tc>
@@ -483,22 +483,7 @@
           <w:p>
             <w:r/>
             <w:r>
-              <w:rPr>
-                <w:b/>
-              </w:rPr>
-              <w:t>Option B (default):</w:t>
-            </w:r>
-            <w:r>
-              <w:t xml:space="preserve"> no login of their own. They see student-level data only in coaching sessions, alongside your team lead on your team lead's screen, under the same agreement, training, and confidentiality as your staff. Outside sessions they work from aggregate views: on-track rate, course failures, attendance by group. </w:t>
-            </w:r>
-            <w:r>
-              <w:rPr>
-                <w:b/>
-              </w:rPr>
-              <w:t>Option A (district may elect):</w:t>
-            </w:r>
-            <w:r>
-              <w:t xml:space="preserve"> their own login to the schools they coach, with every access logged.</w:t>
+              <w:t>Student-level records for that school only, solely for screening, intervention planning, and the team's meetings; every access logged; the district may limit this at any time</w:t>
             </w:r>
           </w:p>
         </w:tc>
@@ -509,7 +494,7 @@
           <w:p>
             <w:r/>
             <w:r>
-              <w:t>To coach your team and measure impact</w:t>
+              <w:t>To prepare for and support the team's work and to measure its progress</w:t>
             </w:r>
           </w:p>
         </w:tc>
@@ -557,7 +542,7 @@
           <w:p>
             <w:r/>
             <w:r>
-              <w:t>CHSS technical staff who run the platform</w:t>
+              <w:t>CHSS technical staff who operate the platform</w:t>
             </w:r>
           </w:p>
         </w:tc>
@@ -588,7 +573,7 @@
     <w:p/>
     <w:p>
       <w:r>
-        <w:t>Records are matched using a consistent unique student identifier, so Navigator stays accurate as students change classes, schedules, and schools.</w:t>
+        <w:t>Records are matched using a consistent unique student identifier, so Navigator remains accurate as students change classes, schedules, and schools.</w:t>
       </w:r>
     </w:p>
     <w:sectPr>

</xml_diff>